<commit_message>
Add one more chapter
</commit_message>
<xml_diff>
--- a/Diploma.docx
+++ b/Diploma.docx
@@ -3001,13 +3001,27 @@
         <w:rPr>
           <w:lang w:val="ru-RU"/>
         </w:rPr>
-        <w:t>эффективной, низко ресурсозатратной</w:t>
-      </w:r>
-      <w:r>
-        <w:rPr>
-          <w:lang w:val="ru-RU"/>
-        </w:rPr>
-        <w:t xml:space="preserve"> архитектуры для задачи </w:t>
+        <w:t xml:space="preserve">эффективной, </w:t>
+      </w:r>
+      <w:proofErr w:type="spellStart"/>
+      <w:r>
+        <w:rPr>
+          <w:lang w:val="ru-RU"/>
+        </w:rPr>
+        <w:t>малоресурсозатратной</w:t>
+      </w:r>
+      <w:proofErr w:type="spellEnd"/>
+      <w:r>
+        <w:rPr>
+          <w:lang w:val="ru-RU"/>
+        </w:rPr>
+        <w:t xml:space="preserve"> </w:t>
+      </w:r>
+      <w:r>
+        <w:rPr>
+          <w:lang w:val="ru-RU"/>
+        </w:rPr>
+        <w:t xml:space="preserve">архитектуры для задачи </w:t>
       </w:r>
       <w:r>
         <w:rPr>
@@ -3049,6 +3063,9 @@
         <w:t>RAVDESS</w:t>
       </w:r>
       <w:r>
+        <w:t xml:space="preserve"> [2]</w:t>
+      </w:r>
+      <w:r>
         <w:rPr>
           <w:lang w:val="ru-RU"/>
         </w:rPr>
@@ -3076,6 +3093,12 @@
         <w:rPr>
           <w:lang w:val="ru-RU"/>
         </w:rPr>
+        <w:t xml:space="preserve"> [3]</w:t>
+      </w:r>
+      <w:r>
+        <w:rPr>
+          <w:lang w:val="ru-RU"/>
+        </w:rPr>
         <w:t>)</w:t>
       </w:r>
       <w:r>
@@ -3089,6 +3112,30 @@
           <w:lang w:val="en-US"/>
         </w:rPr>
         <w:t>IEMOCAP</w:t>
+      </w:r>
+      <w:r>
+        <w:rPr>
+          <w:lang w:val="ru-RU"/>
+        </w:rPr>
+        <w:t xml:space="preserve"> </w:t>
+      </w:r>
+      <w:r>
+        <w:rPr>
+          <w:lang w:val="ru-RU"/>
+        </w:rPr>
+        <w:t>[</w:t>
+      </w:r>
+      <w:r>
+        <w:rPr>
+          <w:lang w:val="ru-RU"/>
+        </w:rPr>
+        <w:t>4</w:t>
+      </w:r>
+      <w:r>
+        <w:rPr>
+          <w:lang w:val="ru-RU"/>
+        </w:rPr>
+        <w:t>]</w:t>
       </w:r>
       <w:r>
         <w:rPr>
@@ -3452,12 +3499,23 @@
         <w:rPr>
           <w:lang w:val="ru-RU"/>
         </w:rPr>
-        <w:t xml:space="preserve"> эмоций с аудиогейтом.</w:t>
-      </w:r>
-    </w:p>
-    <w:p>
-      <w:r>
-        <w:lastRenderedPageBreak/>
+        <w:t xml:space="preserve"> эмоций с </w:t>
+      </w:r>
+      <w:proofErr w:type="spellStart"/>
+      <w:r>
+        <w:rPr>
+          <w:lang w:val="ru-RU"/>
+        </w:rPr>
+        <w:t>аудиогейтом</w:t>
+      </w:r>
+      <w:proofErr w:type="spellEnd"/>
+      <w:r>
+        <w:rPr>
+          <w:lang w:val="ru-RU"/>
+        </w:rPr>
+        <w:t>.</w:t>
+      </w:r>
+      <w:r>
         <w:br w:type="page"/>
       </w:r>
     </w:p>
@@ -3481,12 +3539,796 @@
     <w:p>
       <w:pPr>
         <w:pStyle w:val="Heading2"/>
-      </w:pPr>
-      <w:r>
-        <w:t xml:space="preserve">Обзор </w:t>
+        <w:rPr>
+          <w:lang w:val="ru-RU"/>
+        </w:rPr>
+      </w:pPr>
+      <w:r>
+        <w:rPr>
+          <w:lang w:val="ru-RU"/>
+        </w:rPr>
+        <w:t>Ранние исследования</w:t>
+      </w:r>
+      <w:r>
+        <w:rPr>
+          <w:lang w:val="ru-RU"/>
+        </w:rPr>
+        <w:t xml:space="preserve"> в области </w:t>
       </w:r>
       <w:proofErr w:type="spellStart"/>
       <w:r>
+        <w:rPr>
+          <w:lang w:val="ru-RU"/>
+        </w:rPr>
+        <w:t>распознования</w:t>
+      </w:r>
+      <w:proofErr w:type="spellEnd"/>
+      <w:r>
+        <w:rPr>
+          <w:lang w:val="ru-RU"/>
+        </w:rPr>
+        <w:t xml:space="preserve"> эмоций</w:t>
+      </w:r>
+    </w:p>
+    <w:p>
+      <w:pPr>
+        <w:rPr>
+          <w:lang w:val="ru-RU"/>
+        </w:rPr>
+      </w:pPr>
+      <w:r>
+        <w:rPr>
+          <w:lang w:val="ru-RU"/>
+        </w:rPr>
+        <w:t>Исследования в области распознавания эмоций берут свое начало в работах по психологии и эффективным вычислениям. Фундаментальной основой для большинства современных систем стали работы Пола Экмана и Уоллеса Фризена</w:t>
+      </w:r>
+      <w:r>
+        <w:rPr>
+          <w:lang w:val="ru-RU"/>
+        </w:rPr>
+        <w:t xml:space="preserve">, </w:t>
+      </w:r>
+      <w:r>
+        <w:rPr>
+          <w:lang w:val="ru-RU"/>
+        </w:rPr>
+        <w:t xml:space="preserve">которые в середине 1970-х годов эмпирически обосновали теорию универсальности мимических выражений эмоций. Эта теория говорит о том, что независимо от культурного происхождения и воспитания, люди выражают шесть базовых эмоций сходным образом: счастье, грусть, гнев, страх, удивление и отвращение </w:t>
+      </w:r>
+      <w:r>
+        <w:rPr>
+          <w:lang w:val="ru-RU"/>
+        </w:rPr>
+        <w:t>[17]</w:t>
+      </w:r>
+      <w:r>
+        <w:rPr>
+          <w:lang w:val="ru-RU"/>
+        </w:rPr>
+        <w:t xml:space="preserve">. </w:t>
+      </w:r>
+      <w:r>
+        <w:rPr>
+          <w:lang w:val="ru-RU"/>
+        </w:rPr>
+        <w:t xml:space="preserve">Пол Экман и Уоллес Фризен смогли не только определить 6 классов эмоций, но также они </w:t>
+      </w:r>
+      <w:r>
+        <w:rPr>
+          <w:lang w:val="ru-RU"/>
+        </w:rPr>
+        <w:t xml:space="preserve">предложили детальную систему </w:t>
+      </w:r>
+      <w:r>
+        <w:rPr>
+          <w:lang w:val="ru-RU"/>
+        </w:rPr>
+        <w:t>для классифицирования</w:t>
+      </w:r>
+      <w:r>
+        <w:rPr>
+          <w:lang w:val="ru-RU"/>
+        </w:rPr>
+        <w:t xml:space="preserve"> лицевых выражений (</w:t>
+      </w:r>
+      <w:r>
+        <w:rPr>
+          <w:lang w:val="en-US"/>
+        </w:rPr>
+        <w:t>Facial</w:t>
+      </w:r>
+      <w:r>
+        <w:rPr>
+          <w:lang w:val="ru-RU"/>
+        </w:rPr>
+        <w:t xml:space="preserve"> </w:t>
+      </w:r>
+      <w:r>
+        <w:rPr>
+          <w:lang w:val="en-US"/>
+        </w:rPr>
+        <w:t>Action</w:t>
+      </w:r>
+      <w:r>
+        <w:rPr>
+          <w:lang w:val="ru-RU"/>
+        </w:rPr>
+        <w:t xml:space="preserve"> </w:t>
+      </w:r>
+      <w:r>
+        <w:rPr>
+          <w:lang w:val="en-US"/>
+        </w:rPr>
+        <w:t>Coding</w:t>
+      </w:r>
+      <w:r>
+        <w:rPr>
+          <w:lang w:val="ru-RU"/>
+        </w:rPr>
+        <w:t xml:space="preserve"> </w:t>
+      </w:r>
+      <w:r>
+        <w:rPr>
+          <w:lang w:val="en-US"/>
+        </w:rPr>
+        <w:t>System</w:t>
+      </w:r>
+      <w:r>
+        <w:rPr>
+          <w:lang w:val="ru-RU"/>
+        </w:rPr>
+        <w:t xml:space="preserve">, </w:t>
+      </w:r>
+      <w:r>
+        <w:rPr>
+          <w:lang w:val="en-US"/>
+        </w:rPr>
+        <w:t>FACS</w:t>
+      </w:r>
+      <w:r>
+        <w:rPr>
+          <w:lang w:val="ru-RU"/>
+        </w:rPr>
+        <w:t>)</w:t>
+      </w:r>
+      <w:r>
+        <w:rPr>
+          <w:lang w:val="ru-RU"/>
+        </w:rPr>
+        <w:t xml:space="preserve">, которая позволяет описывать мимические изменения через действия лицевых мышц </w:t>
+      </w:r>
+      <w:r>
+        <w:rPr>
+          <w:lang w:val="ru-RU"/>
+        </w:rPr>
+        <w:t>[18].</w:t>
+      </w:r>
+      <w:r>
+        <w:rPr>
+          <w:lang w:val="ru-RU"/>
+        </w:rPr>
+        <w:t xml:space="preserve"> </w:t>
+      </w:r>
+      <w:r>
+        <w:rPr>
+          <w:lang w:val="ru-RU"/>
+        </w:rPr>
+        <w:t>Эта система до сих пор остается з</w:t>
+      </w:r>
+      <w:r>
+        <w:rPr>
+          <w:lang w:val="ru-RU"/>
+        </w:rPr>
+        <w:t>олотым стандартом для аннотирования выражений лиц в компьютерном зрении.</w:t>
+      </w:r>
+    </w:p>
+    <w:p>
+      <w:pPr>
+        <w:rPr>
+          <w:lang w:val="en-US"/>
+        </w:rPr>
+      </w:pPr>
+      <w:r>
+        <w:rPr>
+          <w:lang w:val="en-US"/>
+        </w:rPr>
+        <w:t>TODO</w:t>
+      </w:r>
+    </w:p>
+    <w:p>
+      <w:pPr>
+        <w:rPr>
+          <w:lang w:val="ru-RU"/>
+        </w:rPr>
+      </w:pPr>
+      <w:r>
+        <w:rPr>
+          <w:lang w:val="ru-RU"/>
+        </w:rPr>
+        <w:t>------</w:t>
+      </w:r>
+    </w:p>
+    <w:p>
+      <w:pPr>
+        <w:rPr>
+          <w:lang w:val="ru-RU"/>
+        </w:rPr>
+      </w:pPr>
+      <w:r>
+        <w:rPr>
+          <w:lang w:val="ru-RU"/>
+        </w:rPr>
+        <w:t xml:space="preserve">Ранние исследования были сфокусированы на одномодальных подходах (определение эмоций только по речи / только по выражению лица). </w:t>
+      </w:r>
+    </w:p>
+    <w:p>
+      <w:pPr>
+        <w:rPr>
+          <w:lang w:val="ru-RU"/>
+        </w:rPr>
+      </w:pPr>
+      <w:r>
+        <w:rPr>
+          <w:lang w:val="ru-RU"/>
+        </w:rPr>
+        <w:t>Первый</w:t>
+      </w:r>
+      <w:r>
+        <w:rPr>
+          <w:lang w:val="ru-RU"/>
+        </w:rPr>
+        <w:t xml:space="preserve"> </w:t>
+      </w:r>
+      <w:r>
+        <w:rPr>
+          <w:lang w:val="ru-RU"/>
+        </w:rPr>
+        <w:t>вид</w:t>
+      </w:r>
+      <w:r>
+        <w:rPr>
+          <w:lang w:val="ru-RU"/>
+        </w:rPr>
+        <w:t xml:space="preserve">: </w:t>
+      </w:r>
+      <w:r>
+        <w:rPr>
+          <w:lang w:val="en-US"/>
+        </w:rPr>
+        <w:t>Speech</w:t>
+      </w:r>
+      <w:r>
+        <w:rPr>
+          <w:lang w:val="ru-RU"/>
+        </w:rPr>
+        <w:t xml:space="preserve"> </w:t>
+      </w:r>
+      <w:r>
+        <w:rPr>
+          <w:lang w:val="en-US"/>
+        </w:rPr>
+        <w:t>emotion</w:t>
+      </w:r>
+      <w:r>
+        <w:rPr>
+          <w:lang w:val="ru-RU"/>
+        </w:rPr>
+        <w:t xml:space="preserve"> </w:t>
+      </w:r>
+      <w:r>
+        <w:rPr>
+          <w:lang w:val="en-US"/>
+        </w:rPr>
+        <w:t>recognition</w:t>
+      </w:r>
+      <w:r>
+        <w:rPr>
+          <w:lang w:val="ru-RU"/>
+        </w:rPr>
+        <w:t xml:space="preserve"> (</w:t>
+      </w:r>
+      <w:r>
+        <w:rPr>
+          <w:lang w:val="en-US"/>
+        </w:rPr>
+        <w:t>SER</w:t>
+      </w:r>
+      <w:r>
+        <w:rPr>
+          <w:lang w:val="ru-RU"/>
+        </w:rPr>
+        <w:t>) [</w:t>
+      </w:r>
+      <w:r>
+        <w:rPr>
+          <w:lang w:val="ru-RU"/>
+        </w:rPr>
+        <w:t xml:space="preserve">7] </w:t>
+      </w:r>
+      <w:r>
+        <w:rPr>
+          <w:lang w:val="ru-RU"/>
+        </w:rPr>
+        <w:t>заключается</w:t>
+      </w:r>
+      <w:r>
+        <w:rPr>
+          <w:lang w:val="ru-RU"/>
+        </w:rPr>
+        <w:t xml:space="preserve"> </w:t>
+      </w:r>
+      <w:r>
+        <w:rPr>
+          <w:lang w:val="ru-RU"/>
+        </w:rPr>
+        <w:t xml:space="preserve">в выделении признаков из речи человека, с помощью, например лог-мел </w:t>
+      </w:r>
+      <w:proofErr w:type="spellStart"/>
+      <w:r>
+        <w:rPr>
+          <w:lang w:val="ru-RU"/>
+        </w:rPr>
+        <w:t>спектограмм</w:t>
+      </w:r>
+      <w:proofErr w:type="spellEnd"/>
+      <w:r>
+        <w:rPr>
+          <w:lang w:val="ru-RU"/>
+        </w:rPr>
+        <w:t xml:space="preserve"> или мел-частотных коэффициентов (</w:t>
+      </w:r>
+      <w:r>
+        <w:rPr>
+          <w:lang w:val="en-US"/>
+        </w:rPr>
+        <w:t>MFCC</w:t>
+      </w:r>
+      <w:r>
+        <w:rPr>
+          <w:lang w:val="ru-RU"/>
+        </w:rPr>
+        <w:t>)</w:t>
+      </w:r>
+      <w:r>
+        <w:rPr>
+          <w:lang w:val="ru-RU"/>
+        </w:rPr>
+        <w:t xml:space="preserve"> и использование классификационных моделей, чтобы определить и выучить общие паттерны эмоций.</w:t>
+      </w:r>
+    </w:p>
+    <w:p>
+      <w:pPr>
+        <w:rPr>
+          <w:lang w:val="ru-RU"/>
+        </w:rPr>
+      </w:pPr>
+      <w:r>
+        <w:rPr>
+          <w:lang w:val="ru-RU"/>
+        </w:rPr>
+        <w:lastRenderedPageBreak/>
+        <w:t>Второй</w:t>
+      </w:r>
+      <w:r>
+        <w:rPr>
+          <w:lang w:val="ru-RU"/>
+        </w:rPr>
+        <w:t xml:space="preserve"> </w:t>
+      </w:r>
+      <w:r>
+        <w:rPr>
+          <w:lang w:val="ru-RU"/>
+        </w:rPr>
+        <w:t>вид</w:t>
+      </w:r>
+      <w:r>
+        <w:rPr>
+          <w:lang w:val="ru-RU"/>
+        </w:rPr>
+        <w:t xml:space="preserve">: </w:t>
+      </w:r>
+      <w:r>
+        <w:rPr>
+          <w:lang w:val="en-US"/>
+        </w:rPr>
+        <w:t>Facial</w:t>
+      </w:r>
+      <w:r>
+        <w:rPr>
+          <w:lang w:val="ru-RU"/>
+        </w:rPr>
+        <w:t xml:space="preserve"> </w:t>
+      </w:r>
+      <w:r>
+        <w:rPr>
+          <w:lang w:val="en-US"/>
+        </w:rPr>
+        <w:t>expression</w:t>
+      </w:r>
+      <w:r>
+        <w:rPr>
+          <w:lang w:val="ru-RU"/>
+        </w:rPr>
+        <w:t xml:space="preserve"> </w:t>
+      </w:r>
+      <w:r>
+        <w:rPr>
+          <w:lang w:val="en-US"/>
+        </w:rPr>
+        <w:t>emotion</w:t>
+      </w:r>
+      <w:r>
+        <w:rPr>
+          <w:lang w:val="ru-RU"/>
+        </w:rPr>
+        <w:t xml:space="preserve"> </w:t>
+      </w:r>
+      <w:r>
+        <w:rPr>
+          <w:lang w:val="en-US"/>
+        </w:rPr>
+        <w:t>recognition</w:t>
+      </w:r>
+      <w:r>
+        <w:rPr>
+          <w:lang w:val="ru-RU"/>
+        </w:rPr>
+        <w:t xml:space="preserve"> (</w:t>
+      </w:r>
+      <w:r>
+        <w:rPr>
+          <w:lang w:val="en-US"/>
+        </w:rPr>
+        <w:t>FER</w:t>
+      </w:r>
+      <w:r>
+        <w:rPr>
+          <w:lang w:val="ru-RU"/>
+        </w:rPr>
+        <w:t xml:space="preserve">) [8] </w:t>
+      </w:r>
+      <w:r>
+        <w:rPr>
+          <w:lang w:val="ru-RU"/>
+        </w:rPr>
+        <w:t>состоит</w:t>
+      </w:r>
+      <w:r>
+        <w:rPr>
+          <w:lang w:val="ru-RU"/>
+        </w:rPr>
+        <w:t xml:space="preserve"> </w:t>
+      </w:r>
+      <w:r>
+        <w:rPr>
+          <w:lang w:val="ru-RU"/>
+        </w:rPr>
+        <w:t>в</w:t>
+      </w:r>
+      <w:r>
+        <w:rPr>
+          <w:lang w:val="ru-RU"/>
+        </w:rPr>
+        <w:t xml:space="preserve"> </w:t>
+      </w:r>
+      <w:r>
+        <w:rPr>
+          <w:lang w:val="ru-RU"/>
+        </w:rPr>
+        <w:t>использовании</w:t>
+      </w:r>
+      <w:r>
+        <w:rPr>
+          <w:lang w:val="ru-RU"/>
+        </w:rPr>
+        <w:t xml:space="preserve"> </w:t>
+      </w:r>
+      <w:r>
+        <w:rPr>
+          <w:lang w:val="ru-RU"/>
+        </w:rPr>
+        <w:t>техник компьютерного зрения (</w:t>
+      </w:r>
+      <w:r>
+        <w:rPr>
+          <w:lang w:val="en-US"/>
+        </w:rPr>
+        <w:t>CV</w:t>
+      </w:r>
+      <w:r>
+        <w:rPr>
+          <w:lang w:val="ru-RU"/>
+        </w:rPr>
+        <w:t>)</w:t>
+      </w:r>
+      <w:r>
+        <w:rPr>
+          <w:lang w:val="ru-RU"/>
+        </w:rPr>
+        <w:t xml:space="preserve">, для отслеживания изменений мышц лица. В фундаментальной работе </w:t>
+      </w:r>
+      <w:r>
+        <w:rPr>
+          <w:lang w:val="en-US"/>
+        </w:rPr>
+        <w:t>Ekman</w:t>
+      </w:r>
+      <w:r>
+        <w:rPr>
+          <w:lang w:val="ru-RU"/>
+        </w:rPr>
+        <w:t xml:space="preserve"> </w:t>
+      </w:r>
+      <w:r>
+        <w:rPr>
+          <w:lang w:val="ru-RU"/>
+        </w:rPr>
+        <w:t xml:space="preserve">и </w:t>
+      </w:r>
+      <w:r>
+        <w:rPr>
+          <w:lang w:val="en-US"/>
+        </w:rPr>
+        <w:t>Friesen</w:t>
+      </w:r>
+      <w:r>
+        <w:rPr>
+          <w:lang w:val="ru-RU"/>
+        </w:rPr>
+        <w:t xml:space="preserve"> </w:t>
+      </w:r>
+      <w:r>
+        <w:rPr>
+          <w:lang w:val="ru-RU"/>
+        </w:rPr>
+        <w:t>[</w:t>
+      </w:r>
+      <w:r>
+        <w:rPr>
+          <w:lang w:val="ru-RU"/>
+        </w:rPr>
+        <w:t xml:space="preserve">9] </w:t>
+      </w:r>
+      <w:r>
+        <w:rPr>
+          <w:lang w:val="ru-RU"/>
+        </w:rPr>
+        <w:t>все мышцы лица были разделены на три основные группы</w:t>
+      </w:r>
+      <w:r>
+        <w:rPr>
+          <w:lang w:val="ru-RU"/>
+        </w:rPr>
+        <w:t xml:space="preserve">, наиболее важные для задачи </w:t>
+      </w:r>
+      <w:r>
+        <w:rPr>
+          <w:lang w:val="en-US"/>
+        </w:rPr>
+        <w:t>FER</w:t>
+      </w:r>
+      <w:r>
+        <w:rPr>
+          <w:lang w:val="ru-RU"/>
+        </w:rPr>
+        <w:t>: брови и лоб, глаза и веки, а также нижняя часть лица</w:t>
+      </w:r>
+      <w:r>
+        <w:rPr>
+          <w:lang w:val="ru-RU"/>
+        </w:rPr>
+        <w:t xml:space="preserve">. </w:t>
+      </w:r>
+    </w:p>
+    <w:p>
+      <w:pPr>
+        <w:rPr>
+          <w:lang w:val="ru-RU"/>
+        </w:rPr>
+      </w:pPr>
+      <w:r>
+        <w:rPr>
+          <w:lang w:val="ru-RU"/>
+        </w:rPr>
+        <w:t>Однако, одномодальные системы ограничены по двум параметрам: количеству информации, которую можно получить из одной модальности и подверженности влиянию окружающих факторов (шум, недостаток света и т.д.). Это приводит к следующему этапу развития систем классификации эмоций: мультимодальные системы.</w:t>
+      </w:r>
+    </w:p>
+    <w:p>
+      <w:pPr>
+        <w:rPr>
+          <w:lang w:val="ru-RU"/>
+        </w:rPr>
+      </w:pPr>
+      <w:r>
+        <w:rPr>
+          <w:lang w:val="ru-RU"/>
+        </w:rPr>
+        <w:t>Мультимодальные системы определения эмоций (</w:t>
+      </w:r>
+      <w:r>
+        <w:rPr>
+          <w:lang w:val="en-US"/>
+        </w:rPr>
+        <w:t>MER</w:t>
+      </w:r>
+      <w:r>
+        <w:rPr>
+          <w:lang w:val="ru-RU"/>
+        </w:rPr>
+        <w:t xml:space="preserve">) </w:t>
+      </w:r>
+      <w:r>
+        <w:rPr>
+          <w:lang w:val="ru-RU"/>
+        </w:rPr>
+        <w:t>[</w:t>
+      </w:r>
+      <w:r>
+        <w:rPr>
+          <w:lang w:val="ru-RU"/>
+        </w:rPr>
+        <w:t>10]</w:t>
+      </w:r>
+      <w:r>
+        <w:rPr>
+          <w:lang w:val="ru-RU"/>
+        </w:rPr>
+        <w:t xml:space="preserve"> </w:t>
+      </w:r>
+      <w:r>
+        <w:rPr>
+          <w:lang w:val="ru-RU"/>
+        </w:rPr>
+        <w:t xml:space="preserve">являются объединением систем </w:t>
+      </w:r>
+      <w:r>
+        <w:rPr>
+          <w:lang w:val="en-US"/>
+        </w:rPr>
+        <w:t>SER</w:t>
+      </w:r>
+      <w:r>
+        <w:rPr>
+          <w:lang w:val="ru-RU"/>
+        </w:rPr>
+        <w:t xml:space="preserve">, </w:t>
+      </w:r>
+      <w:r>
+        <w:rPr>
+          <w:lang w:val="en-US"/>
+        </w:rPr>
+        <w:t>FER</w:t>
+      </w:r>
+      <w:r>
+        <w:rPr>
+          <w:lang w:val="ru-RU"/>
+        </w:rPr>
+        <w:t xml:space="preserve">, </w:t>
+      </w:r>
+      <w:r>
+        <w:rPr>
+          <w:lang w:val="ru-RU"/>
+        </w:rPr>
+        <w:t xml:space="preserve">а также не описанной ранее системы определения эмоций по тексту (расшифровке речи человека) для более </w:t>
+      </w:r>
+      <w:r>
+        <w:rPr>
+          <w:lang w:val="ru-RU"/>
+        </w:rPr>
+        <w:t>надежной</w:t>
+      </w:r>
+      <w:r>
+        <w:rPr>
+          <w:lang w:val="ru-RU"/>
+        </w:rPr>
+        <w:t xml:space="preserve"> и качественно</w:t>
+      </w:r>
+      <w:r>
+        <w:rPr>
+          <w:lang w:val="ru-RU"/>
+        </w:rPr>
+        <w:t>й классификации.</w:t>
+      </w:r>
+      <w:r>
+        <w:rPr>
+          <w:lang w:val="ru-RU"/>
+        </w:rPr>
+        <w:t xml:space="preserve"> Один из примеров </w:t>
+      </w:r>
+      <w:r>
+        <w:rPr>
+          <w:lang w:val="en-US"/>
+        </w:rPr>
+        <w:t>MER</w:t>
+      </w:r>
+      <w:r>
+        <w:rPr>
+          <w:lang w:val="ru-RU"/>
+        </w:rPr>
+        <w:t xml:space="preserve"> </w:t>
+      </w:r>
+      <w:r>
+        <w:rPr>
+          <w:lang w:val="ru-RU"/>
+        </w:rPr>
+        <w:t xml:space="preserve">архитектуры, основанный на </w:t>
+      </w:r>
+      <w:proofErr w:type="spellStart"/>
+      <w:r>
+        <w:rPr>
+          <w:lang w:val="ru-RU"/>
+        </w:rPr>
+        <w:t>графовых</w:t>
+      </w:r>
+      <w:proofErr w:type="spellEnd"/>
+      <w:r>
+        <w:rPr>
+          <w:lang w:val="ru-RU"/>
+        </w:rPr>
+        <w:t xml:space="preserve"> нейросетях </w:t>
+      </w:r>
+      <w:r>
+        <w:rPr>
+          <w:lang w:val="ru-RU"/>
+        </w:rPr>
+        <w:t xml:space="preserve">[11] </w:t>
+      </w:r>
+      <w:r>
+        <w:rPr>
+          <w:lang w:val="ru-RU"/>
+        </w:rPr>
+        <w:t>показал, что данный подход способен показывать высокие метрики качества, однако требует большого количества вычислительных ресурсов.</w:t>
+      </w:r>
+      <w:r>
+        <w:rPr>
+          <w:lang w:val="ru-RU"/>
+        </w:rPr>
+        <w:t xml:space="preserve"> Именно в этом и заключается </w:t>
+      </w:r>
+      <w:r>
+        <w:rPr>
+          <w:lang w:val="ru-RU"/>
+        </w:rPr>
+        <w:t xml:space="preserve">основная проблема использования </w:t>
+      </w:r>
+      <w:r>
+        <w:rPr>
+          <w:lang w:val="en-US"/>
+        </w:rPr>
+        <w:t>MER</w:t>
+      </w:r>
+      <w:r>
+        <w:rPr>
+          <w:lang w:val="ru-RU"/>
+        </w:rPr>
+        <w:t xml:space="preserve"> </w:t>
+      </w:r>
+      <w:r>
+        <w:rPr>
+          <w:lang w:val="ru-RU"/>
+        </w:rPr>
+        <w:t xml:space="preserve">систем в приложениях, которые обрабатывают данные в реальном времени. </w:t>
+      </w:r>
+    </w:p>
+    <w:p>
+      <w:pPr>
+        <w:pStyle w:val="Heading2"/>
+      </w:pPr>
+      <w:r>
+        <w:rPr>
+          <w:lang w:val="ru-RU"/>
+        </w:rPr>
+        <w:t xml:space="preserve"> </w:t>
+      </w:r>
+      <w:proofErr w:type="spellStart"/>
+      <w:r>
+        <w:t>Обзор</w:t>
+      </w:r>
+      <w:proofErr w:type="spellEnd"/>
+      <w:r>
+        <w:t xml:space="preserve"> </w:t>
+      </w:r>
+      <w:proofErr w:type="spellStart"/>
+      <w:r>
         <w:t>существующих</w:t>
       </w:r>
       <w:proofErr w:type="spellEnd"/>
@@ -3549,622 +4391,15 @@
         <w:rPr>
           <w:lang w:val="ru-RU"/>
         </w:rPr>
-        <w:t xml:space="preserve"> с детектированием эмоций в речи подразумевает определение эмоции по двум модальностям: голосу</w:t>
-      </w:r>
-      <w:r>
-        <w:rPr>
-          <w:lang w:val="ru-RU"/>
-        </w:rPr>
-        <w:t xml:space="preserve"> </w:t>
-      </w:r>
-      <w:r>
-        <w:rPr>
-          <w:lang w:val="ru-RU"/>
-        </w:rPr>
-        <w:t>и выражению лица человека.</w:t>
-      </w:r>
-      <w:r>
-        <w:rPr>
-          <w:lang w:val="ru-RU"/>
-        </w:rPr>
-        <w:t xml:space="preserve"> Рассмотрим уже существующие подходы по данным темам.</w:t>
-      </w:r>
-    </w:p>
-    <w:p>
-      <w:pPr>
-        <w:pStyle w:val="Heading2"/>
-        <w:rPr>
-          <w:lang w:val="ru-RU"/>
-        </w:rPr>
-      </w:pPr>
-      <w:proofErr w:type="spellStart"/>
-      <w:r>
-        <w:t>Ранние</w:t>
-      </w:r>
-      <w:proofErr w:type="spellEnd"/>
-      <w:r>
-        <w:t xml:space="preserve"> </w:t>
-      </w:r>
-      <w:proofErr w:type="spellStart"/>
-      <w:r>
-        <w:t>исследования</w:t>
-      </w:r>
-      <w:proofErr w:type="spellEnd"/>
-    </w:p>
-    <w:p>
-      <w:pPr>
-        <w:rPr>
-          <w:lang w:val="ru-RU"/>
-        </w:rPr>
-      </w:pPr>
-      <w:r>
-        <w:rPr>
-          <w:lang w:val="ru-RU"/>
-        </w:rPr>
-        <w:t xml:space="preserve">Ранние исследования были сфокусированы на одномодальных подходах (определение эмоций только по речи / только по выражению лица). </w:t>
-      </w:r>
-    </w:p>
-    <w:p>
-      <w:pPr>
-        <w:rPr>
-          <w:lang w:val="ru-RU"/>
-        </w:rPr>
-      </w:pPr>
-      <w:r>
-        <w:rPr>
-          <w:lang w:val="ru-RU"/>
-        </w:rPr>
-        <w:t>Первый</w:t>
-      </w:r>
-      <w:r>
-        <w:rPr>
-          <w:lang w:val="ru-RU"/>
-        </w:rPr>
-        <w:t xml:space="preserve"> </w:t>
-      </w:r>
-      <w:r>
-        <w:rPr>
-          <w:lang w:val="ru-RU"/>
-        </w:rPr>
-        <w:t>вид</w:t>
-      </w:r>
-      <w:r>
-        <w:rPr>
-          <w:lang w:val="ru-RU"/>
-        </w:rPr>
-        <w:t xml:space="preserve">: </w:t>
-      </w:r>
-      <w:r>
-        <w:rPr>
-          <w:lang w:val="en-US"/>
-        </w:rPr>
-        <w:t>Speech</w:t>
-      </w:r>
-      <w:r>
-        <w:rPr>
-          <w:lang w:val="ru-RU"/>
-        </w:rPr>
-        <w:t xml:space="preserve"> </w:t>
-      </w:r>
-      <w:r>
-        <w:rPr>
-          <w:lang w:val="en-US"/>
-        </w:rPr>
-        <w:t>emotion</w:t>
-      </w:r>
-      <w:r>
-        <w:rPr>
-          <w:lang w:val="ru-RU"/>
-        </w:rPr>
-        <w:t xml:space="preserve"> </w:t>
-      </w:r>
-      <w:r>
-        <w:rPr>
-          <w:lang w:val="en-US"/>
-        </w:rPr>
-        <w:t>recognition</w:t>
-      </w:r>
-      <w:r>
-        <w:rPr>
-          <w:lang w:val="ru-RU"/>
-        </w:rPr>
-        <w:t xml:space="preserve"> (</w:t>
-      </w:r>
-      <w:r>
-        <w:rPr>
-          <w:lang w:val="en-US"/>
-        </w:rPr>
-        <w:t>SER</w:t>
-      </w:r>
-      <w:r>
-        <w:rPr>
-          <w:lang w:val="ru-RU"/>
-        </w:rPr>
-        <w:t>) [</w:t>
-      </w:r>
-      <w:r>
-        <w:rPr>
-          <w:lang w:val="ru-RU"/>
-        </w:rPr>
-        <w:t xml:space="preserve">7] </w:t>
-      </w:r>
-      <w:r>
-        <w:rPr>
-          <w:lang w:val="ru-RU"/>
-        </w:rPr>
-        <w:t>заключается</w:t>
-      </w:r>
-      <w:r>
-        <w:rPr>
-          <w:lang w:val="ru-RU"/>
-        </w:rPr>
-        <w:t xml:space="preserve"> </w:t>
-      </w:r>
-      <w:r>
-        <w:rPr>
-          <w:lang w:val="ru-RU"/>
-        </w:rPr>
-        <w:t xml:space="preserve">в выделении признаков из речи человека, с помощью, например лог-мел </w:t>
-      </w:r>
-      <w:proofErr w:type="spellStart"/>
-      <w:r>
-        <w:rPr>
-          <w:lang w:val="ru-RU"/>
-        </w:rPr>
-        <w:t>спектограмм</w:t>
-      </w:r>
-      <w:proofErr w:type="spellEnd"/>
-      <w:r>
-        <w:rPr>
-          <w:lang w:val="ru-RU"/>
-        </w:rPr>
-        <w:t xml:space="preserve"> или мел-частотных коэффициентов (</w:t>
-      </w:r>
-      <w:r>
-        <w:rPr>
-          <w:lang w:val="en-US"/>
-        </w:rPr>
-        <w:t>MFCC</w:t>
-      </w:r>
-      <w:r>
-        <w:rPr>
-          <w:lang w:val="ru-RU"/>
-        </w:rPr>
-        <w:t>)</w:t>
-      </w:r>
-      <w:r>
-        <w:rPr>
-          <w:lang w:val="ru-RU"/>
-        </w:rPr>
-        <w:t xml:space="preserve"> и использование классификационных моделей, чтобы определить и выучить общие паттерны эмоций.</w:t>
-      </w:r>
-    </w:p>
-    <w:p>
-      <w:pPr>
-        <w:rPr>
-          <w:lang w:val="ru-RU"/>
-        </w:rPr>
-      </w:pPr>
-      <w:r>
-        <w:rPr>
-          <w:lang w:val="ru-RU"/>
-        </w:rPr>
-        <w:t>Второй</w:t>
-      </w:r>
-      <w:r>
-        <w:rPr>
-          <w:lang w:val="ru-RU"/>
-        </w:rPr>
-        <w:t xml:space="preserve"> </w:t>
-      </w:r>
-      <w:r>
-        <w:rPr>
-          <w:lang w:val="ru-RU"/>
-        </w:rPr>
-        <w:t>вид</w:t>
-      </w:r>
-      <w:r>
-        <w:rPr>
-          <w:lang w:val="ru-RU"/>
-        </w:rPr>
-        <w:t xml:space="preserve">: </w:t>
-      </w:r>
-      <w:r>
-        <w:rPr>
-          <w:lang w:val="en-US"/>
-        </w:rPr>
-        <w:t>Facial</w:t>
-      </w:r>
-      <w:r>
-        <w:rPr>
-          <w:lang w:val="ru-RU"/>
-        </w:rPr>
-        <w:t xml:space="preserve"> </w:t>
-      </w:r>
-      <w:r>
-        <w:rPr>
-          <w:lang w:val="en-US"/>
-        </w:rPr>
-        <w:t>expression</w:t>
-      </w:r>
-      <w:r>
-        <w:rPr>
-          <w:lang w:val="ru-RU"/>
-        </w:rPr>
-        <w:t xml:space="preserve"> </w:t>
-      </w:r>
-      <w:r>
-        <w:rPr>
-          <w:lang w:val="en-US"/>
-        </w:rPr>
-        <w:t>emotion</w:t>
-      </w:r>
-      <w:r>
-        <w:rPr>
-          <w:lang w:val="ru-RU"/>
-        </w:rPr>
-        <w:t xml:space="preserve"> </w:t>
-      </w:r>
-      <w:r>
-        <w:rPr>
-          <w:lang w:val="en-US"/>
-        </w:rPr>
-        <w:t>recognition</w:t>
-      </w:r>
-      <w:r>
-        <w:rPr>
-          <w:lang w:val="ru-RU"/>
-        </w:rPr>
-        <w:t xml:space="preserve"> (</w:t>
-      </w:r>
-      <w:r>
-        <w:rPr>
-          <w:lang w:val="en-US"/>
-        </w:rPr>
-        <w:t>FER</w:t>
-      </w:r>
-      <w:r>
-        <w:rPr>
-          <w:lang w:val="ru-RU"/>
-        </w:rPr>
-        <w:t xml:space="preserve">) [8] </w:t>
-      </w:r>
-      <w:r>
-        <w:rPr>
-          <w:lang w:val="ru-RU"/>
-        </w:rPr>
-        <w:t>состоит</w:t>
-      </w:r>
-      <w:r>
-        <w:rPr>
-          <w:lang w:val="ru-RU"/>
-        </w:rPr>
-        <w:t xml:space="preserve"> </w:t>
-      </w:r>
-      <w:r>
-        <w:rPr>
-          <w:lang w:val="ru-RU"/>
-        </w:rPr>
-        <w:t>в</w:t>
-      </w:r>
-      <w:r>
-        <w:rPr>
-          <w:lang w:val="ru-RU"/>
-        </w:rPr>
-        <w:t xml:space="preserve"> </w:t>
-      </w:r>
-      <w:r>
-        <w:rPr>
-          <w:lang w:val="ru-RU"/>
-        </w:rPr>
-        <w:t>использовании</w:t>
-      </w:r>
-      <w:r>
-        <w:rPr>
-          <w:lang w:val="ru-RU"/>
-        </w:rPr>
-        <w:t xml:space="preserve"> </w:t>
-      </w:r>
-      <w:r>
-        <w:rPr>
-          <w:lang w:val="ru-RU"/>
-        </w:rPr>
-        <w:t>техник компьютерного зрения (</w:t>
-      </w:r>
-      <w:r>
-        <w:rPr>
-          <w:lang w:val="en-US"/>
-        </w:rPr>
-        <w:t>CV</w:t>
-      </w:r>
-      <w:r>
-        <w:rPr>
-          <w:lang w:val="ru-RU"/>
-        </w:rPr>
-        <w:t>)</w:t>
-      </w:r>
-      <w:r>
-        <w:rPr>
-          <w:lang w:val="ru-RU"/>
-        </w:rPr>
-        <w:t xml:space="preserve">, для отслеживания изменений мышц лица. В фундаментальной работе </w:t>
-      </w:r>
-      <w:r>
-        <w:rPr>
-          <w:lang w:val="en-US"/>
-        </w:rPr>
-        <w:t>Ekman</w:t>
-      </w:r>
-      <w:r>
-        <w:rPr>
-          <w:lang w:val="ru-RU"/>
-        </w:rPr>
-        <w:t xml:space="preserve"> </w:t>
-      </w:r>
-      <w:r>
-        <w:rPr>
-          <w:lang w:val="ru-RU"/>
-        </w:rPr>
-        <w:t xml:space="preserve">и </w:t>
-      </w:r>
-      <w:r>
-        <w:rPr>
-          <w:lang w:val="en-US"/>
-        </w:rPr>
-        <w:t>Friesen</w:t>
-      </w:r>
-      <w:r>
-        <w:rPr>
-          <w:lang w:val="ru-RU"/>
-        </w:rPr>
-        <w:t xml:space="preserve"> </w:t>
-      </w:r>
-      <w:r>
-        <w:rPr>
-          <w:lang w:val="ru-RU"/>
-        </w:rPr>
-        <w:t>[</w:t>
-      </w:r>
-      <w:r>
-        <w:rPr>
-          <w:lang w:val="ru-RU"/>
-        </w:rPr>
-        <w:t xml:space="preserve">9] </w:t>
-      </w:r>
-      <w:r>
-        <w:rPr>
-          <w:lang w:val="ru-RU"/>
-        </w:rPr>
-        <w:t>все мышцы лица были разделены на три основные группы</w:t>
-      </w:r>
-      <w:r>
-        <w:rPr>
-          <w:lang w:val="ru-RU"/>
-        </w:rPr>
-        <w:t xml:space="preserve">, наиболее важные для задачи </w:t>
-      </w:r>
-      <w:r>
-        <w:rPr>
-          <w:lang w:val="en-US"/>
-        </w:rPr>
-        <w:t>FER</w:t>
-      </w:r>
-      <w:r>
-        <w:rPr>
-          <w:lang w:val="ru-RU"/>
-        </w:rPr>
-        <w:t>: брови и лоб, глаза и веки, а также нижняя часть лица</w:t>
-      </w:r>
-      <w:r>
-        <w:rPr>
-          <w:lang w:val="ru-RU"/>
-        </w:rPr>
-        <w:t xml:space="preserve">. </w:t>
-      </w:r>
-    </w:p>
-    <w:p>
-      <w:pPr>
-        <w:rPr>
-          <w:lang w:val="ru-RU"/>
-        </w:rPr>
-      </w:pPr>
-      <w:r>
-        <w:rPr>
-          <w:lang w:val="ru-RU"/>
-        </w:rPr>
-        <w:t>Однако, одномодальные системы ограничены по двум параметрам: количеству информации, которую можно получить из одной модальности и подверженности влиянию окружающих факторов (шум, недостаток света и т.д.). Это приводит к следующему этапу развития систем классификации эмоций: мультимодальные системы.</w:t>
-      </w:r>
-    </w:p>
-    <w:p>
-      <w:pPr>
-        <w:rPr>
-          <w:lang w:val="ru-RU"/>
-        </w:rPr>
-      </w:pPr>
-      <w:r>
-        <w:rPr>
-          <w:lang w:val="ru-RU"/>
-        </w:rPr>
-        <w:lastRenderedPageBreak/>
-        <w:t>Мультимодальные системы определения эмоций (</w:t>
-      </w:r>
-      <w:r>
-        <w:rPr>
-          <w:lang w:val="en-US"/>
-        </w:rPr>
-        <w:t>MER</w:t>
-      </w:r>
-      <w:r>
-        <w:rPr>
-          <w:lang w:val="ru-RU"/>
-        </w:rPr>
-        <w:t xml:space="preserve">) </w:t>
-      </w:r>
-      <w:r>
-        <w:rPr>
-          <w:lang w:val="ru-RU"/>
-        </w:rPr>
-        <w:t>[</w:t>
-      </w:r>
-      <w:r>
-        <w:rPr>
-          <w:lang w:val="ru-RU"/>
-        </w:rPr>
-        <w:t>10]</w:t>
-      </w:r>
-      <w:r>
-        <w:rPr>
-          <w:lang w:val="ru-RU"/>
-        </w:rPr>
-        <w:t xml:space="preserve"> </w:t>
-      </w:r>
-      <w:r>
-        <w:rPr>
-          <w:lang w:val="ru-RU"/>
-        </w:rPr>
-        <w:t xml:space="preserve">являются объединением систем </w:t>
-      </w:r>
-      <w:r>
-        <w:rPr>
-          <w:lang w:val="en-US"/>
-        </w:rPr>
-        <w:t>SER</w:t>
-      </w:r>
-      <w:r>
-        <w:rPr>
-          <w:lang w:val="ru-RU"/>
-        </w:rPr>
-        <w:t xml:space="preserve">, </w:t>
-      </w:r>
-      <w:r>
-        <w:rPr>
-          <w:lang w:val="en-US"/>
-        </w:rPr>
-        <w:t>FER</w:t>
-      </w:r>
-      <w:r>
-        <w:rPr>
-          <w:lang w:val="ru-RU"/>
-        </w:rPr>
-        <w:t xml:space="preserve">, </w:t>
-      </w:r>
-      <w:r>
-        <w:rPr>
-          <w:lang w:val="ru-RU"/>
-        </w:rPr>
-        <w:t xml:space="preserve">а также не описанной ранее системы определения эмоций по тексту (расшифровке речи человека) для более </w:t>
-      </w:r>
-      <w:r>
-        <w:rPr>
-          <w:lang w:val="ru-RU"/>
-        </w:rPr>
-        <w:t>надежной</w:t>
-      </w:r>
-      <w:r>
-        <w:rPr>
-          <w:lang w:val="ru-RU"/>
-        </w:rPr>
-        <w:t xml:space="preserve"> и качественно</w:t>
-      </w:r>
-      <w:r>
-        <w:rPr>
-          <w:lang w:val="ru-RU"/>
-        </w:rPr>
-        <w:t>й классификации.</w:t>
-      </w:r>
-      <w:r>
-        <w:rPr>
-          <w:lang w:val="ru-RU"/>
-        </w:rPr>
-        <w:t xml:space="preserve"> Один из примеров </w:t>
-      </w:r>
-      <w:r>
-        <w:rPr>
-          <w:lang w:val="en-US"/>
-        </w:rPr>
-        <w:t>MER</w:t>
-      </w:r>
-      <w:r>
-        <w:rPr>
-          <w:lang w:val="ru-RU"/>
-        </w:rPr>
-        <w:t xml:space="preserve"> </w:t>
-      </w:r>
-      <w:r>
-        <w:rPr>
-          <w:lang w:val="ru-RU"/>
-        </w:rPr>
-        <w:t xml:space="preserve">архитектуры, основанный на </w:t>
-      </w:r>
-      <w:proofErr w:type="spellStart"/>
-      <w:r>
-        <w:rPr>
-          <w:lang w:val="ru-RU"/>
-        </w:rPr>
-        <w:t>графовых</w:t>
-      </w:r>
-      <w:proofErr w:type="spellEnd"/>
-      <w:r>
-        <w:rPr>
-          <w:lang w:val="ru-RU"/>
-        </w:rPr>
-        <w:t xml:space="preserve"> нейросетях </w:t>
-      </w:r>
-      <w:r>
-        <w:rPr>
-          <w:lang w:val="ru-RU"/>
-        </w:rPr>
-        <w:t xml:space="preserve">[11] </w:t>
-      </w:r>
-      <w:r>
-        <w:rPr>
-          <w:lang w:val="ru-RU"/>
-        </w:rPr>
-        <w:t>показал, что данный подход способен показывать высокие метрики качества, однако требует большого количества вычислительных ресурсов.</w:t>
-      </w:r>
-      <w:r>
-        <w:rPr>
-          <w:lang w:val="ru-RU"/>
-        </w:rPr>
-        <w:t xml:space="preserve"> Именно в этом и заключается </w:t>
-      </w:r>
-      <w:r>
-        <w:rPr>
-          <w:lang w:val="ru-RU"/>
-        </w:rPr>
-        <w:t xml:space="preserve">основная проблема использования </w:t>
-      </w:r>
-      <w:r>
-        <w:rPr>
-          <w:lang w:val="en-US"/>
-        </w:rPr>
-        <w:t>MER</w:t>
-      </w:r>
-      <w:r>
-        <w:rPr>
-          <w:lang w:val="ru-RU"/>
-        </w:rPr>
-        <w:t xml:space="preserve"> </w:t>
-      </w:r>
-      <w:r>
-        <w:rPr>
-          <w:lang w:val="ru-RU"/>
-        </w:rPr>
-        <w:t xml:space="preserve">систем в приложениях, которые обрабатывают данные в реальном времени. </w:t>
-      </w:r>
-    </w:p>
-    <w:p>
-      <w:pPr>
-        <w:rPr>
-          <w:lang w:val="ru-RU"/>
-        </w:rPr>
-      </w:pPr>
-      <w:r>
-        <w:rPr>
-          <w:lang w:val="ru-RU"/>
-        </w:rPr>
-        <w:t xml:space="preserve"> </w:t>
-      </w:r>
+        <w:t xml:space="preserve"> с детектированием эмоций в речи подразумевает определение эмоции по двум модальностям: голосу и выражению лица человека. Рассмотрим уже существующие подходы по данным темам.</w:t>
+      </w:r>
+    </w:p>
+    <w:p>
+      <w:pPr>
+        <w:rPr>
+          <w:lang w:val="ru-RU"/>
+        </w:rPr>
+      </w:pPr>
       <w:r>
         <w:br w:type="page"/>
       </w:r>
@@ -6040,19 +6275,26 @@
         </w:rPr>
         <w:t xml:space="preserve">: Multimodal Emotion Recognition with Cross-Attention Gated Mixture of Experts. </w:t>
       </w:r>
-      <w:proofErr w:type="spellStart"/>
-      <w:r>
-        <w:rPr>
-          <w:lang w:val="ru-RU"/>
-        </w:rPr>
-        <w:t>Mathematics</w:t>
-      </w:r>
-      <w:proofErr w:type="spellEnd"/>
-      <w:r>
-        <w:rPr>
-          <w:lang w:val="ru-RU"/>
-        </w:rPr>
-        <w:t>, 13(12), 1907. https://doi.org/10.3390/math13121907</w:t>
+      <w:r>
+        <w:rPr>
+          <w:lang w:val="en-US"/>
+        </w:rPr>
+        <w:t xml:space="preserve">Mathematics, 13(12), 1907. </w:t>
+      </w:r>
+      <w:hyperlink r:id="rId9" w:history="1">
+        <w:r>
+          <w:rPr>
+            <w:rStyle w:val="Hyperlink"/>
+            <w:lang w:val="en-US"/>
+          </w:rPr>
+          <w:t>https://doi.org/10.3390/math13121907</w:t>
+        </w:r>
+      </w:hyperlink>
+      <w:r>
+        <w:rPr>
+          <w:lang w:val="en-US"/>
+        </w:rPr>
+        <w:t>.</w:t>
       </w:r>
     </w:p>
     <w:p>
@@ -6063,14 +6305,50 @@
           <w:numId w:val="19"/>
         </w:numPr>
         <w:rPr>
-          <w:lang w:val="en-US"/>
-        </w:rPr>
-      </w:pPr>
+          <w:lang w:val="ru-RU"/>
+        </w:rPr>
+      </w:pPr>
+      <w:r>
+        <w:rPr>
+          <w:lang w:val="en-US"/>
+        </w:rPr>
+        <w:t>Ekman, P., &amp; Friesen, W. V. (1975). Unmasking the Face: A guide to recognizing emotions from facial clues. Englewood Cliffs, NJ: Prentice-Hall.</w:t>
+      </w:r>
+    </w:p>
+    <w:p>
+      <w:pPr>
+        <w:pStyle w:val="ListParagraph"/>
+        <w:numPr>
+          <w:ilvl w:val="0"/>
+          <w:numId w:val="19"/>
+        </w:numPr>
+        <w:rPr>
+          <w:lang w:val="ru-RU"/>
+        </w:rPr>
+      </w:pPr>
+      <w:r>
+        <w:rPr>
+          <w:lang w:val="en-US"/>
+        </w:rPr>
+        <w:t>Ekman, P. and Friesen, W.V. (1978) Facial Action Coding System: A Technique for the Measurement of Facial Movement. Consulting Psychologists Press, Palo Alto, CA.</w:t>
+      </w:r>
+      <w:r>
+        <w:rPr>
+          <w:lang w:val="en-US"/>
+        </w:rPr>
+        <w:t xml:space="preserve"> </w:t>
+      </w:r>
+      <w:r>
+        <w:rPr>
+          <w:lang w:val="en-US"/>
+        </w:rPr>
+        <w:t>https://doi.org/10.1037/t27734-000</w:t>
+      </w:r>
     </w:p>
     <w:sectPr>
-      <w:headerReference w:type="default" r:id="rId9"/>
-      <w:footerReference w:type="even" r:id="rId10"/>
-      <w:footerReference w:type="default" r:id="rId11"/>
+      <w:headerReference w:type="default" r:id="rId10"/>
+      <w:footerReference w:type="even" r:id="rId11"/>
+      <w:footerReference w:type="default" r:id="rId12"/>
       <w:pgSz w:w="11906" w:h="16838"/>
       <w:pgMar w:top="1134" w:right="1134" w:bottom="1418" w:left="1134" w:header="709" w:footer="709" w:gutter="0"/>
       <w:pgNumType w:start="1"/>
@@ -8875,7 +9153,6 @@
   <w:style w:type="character" w:default="1" w:styleId="DefaultParagraphFont">
     <w:name w:val="Default Paragraph Font"/>
     <w:uiPriority w:val="1"/>
-    <w:semiHidden/>
     <w:unhideWhenUsed/>
   </w:style>
   <w:style w:type="table" w:default="1" w:styleId="TableNormal">

</xml_diff>